<commit_message>
Update public repository availability statements
</commit_message>
<xml_diff>
--- a/TMEM158_CaUPR_ESCC/07_manuscript/manuscript_scientific_reports.docx
+++ b/TMEM158_CaUPR_ESCC/07_manuscript/manuscript_scientific_reports.docx
@@ -1735,7 +1735,7 @@
           <w:rFonts w:ascii="Times New Roman" w:hAnsi="Times New Roman" w:eastAsia="宋体"/>
           <w:sz w:val="22"/>
         </w:rPr>
-        <w:t>All data analysed in this study were obtained from public resources, including TCGA/GDC or cBioPortal, GEO, DepMap-derived public resources, UniProt, QuickGO, the Human Protein Atlas and the AlphaFold Protein Structure Database [1,9,17,18,22-25]. No new patient-level dataset was generated in this study. Processed intermediate tables and analysis outputs are available from the corresponding author upon reasonable request.</w:t>
+        <w:t>All data analysed in this study were obtained from public resources, including TCGA/GDC or cBioPortal, GEO, DepMap-derived public resources, UniProt, QuickGO, the Human Protein Atlas and the AlphaFold Protein Structure Database [1,9,17,18,22-25]. No new patient-level dataset was generated in this study. Processed intermediate tables and analysis outputs are available in the public GitHub repository at https://github.com/afa-cloud/TMEM158_CaUPR_ESCC.</w:t>
       </w:r>
     </w:p>
     <w:p>
@@ -1804,7 +1804,7 @@
           <w:rFonts w:ascii="Times New Roman" w:hAnsi="Times New Roman" w:eastAsia="宋体"/>
           <w:sz w:val="22"/>
         </w:rPr>
-        <w:t>. The code has not been deposited in a public repository before initial submission and is available from the corresponding author upon reasonable request.</w:t>
+        <w:t>. The code is publicly available in the GitHub repository at https://github.com/afa-cloud/TMEM158_CaUPR_ESCC.</w:t>
       </w:r>
     </w:p>
     <w:p>

</xml_diff>

<commit_message>
Add versioned initial submission release URL
</commit_message>
<xml_diff>
--- a/TMEM158_CaUPR_ESCC/07_manuscript/manuscript_scientific_reports.docx
+++ b/TMEM158_CaUPR_ESCC/07_manuscript/manuscript_scientific_reports.docx
@@ -1735,7 +1735,7 @@
           <w:rFonts w:ascii="Times New Roman" w:hAnsi="Times New Roman" w:eastAsia="宋体"/>
           <w:sz w:val="22"/>
         </w:rPr>
-        <w:t>All data analysed in this study were obtained from public resources, including TCGA/GDC or cBioPortal, GEO, DepMap-derived public resources, UniProt, QuickGO, the Human Protein Atlas and the AlphaFold Protein Structure Database [1,9,17,18,22-25]. No new patient-level dataset was generated in this study. Processed intermediate tables and analysis outputs are available in the public GitHub repository at https://github.com/afa-cloud/TMEM158_CaUPR_ESCC.</w:t>
+        <w:t>All data analysed in this study were obtained from public resources, including TCGA/GDC or cBioPortal, GEO, DepMap-derived public resources, UniProt, QuickGO, the Human Protein Atlas and the AlphaFold Protein Structure Database [1,9,17,18,22-25]. No new patient-level dataset was generated in this study. Processed intermediate tables and analysis outputs are available in the public GitHub repository at https://github.com/afa-cloud/TMEM158_CaUPR_ESCC, with an initial-submission release at https://github.com/afa-cloud/TMEM158_CaUPR_ESCC/releases/tag/v1.0-initial-submission.</w:t>
       </w:r>
     </w:p>
     <w:p>
@@ -1804,7 +1804,7 @@
           <w:rFonts w:ascii="Times New Roman" w:hAnsi="Times New Roman" w:eastAsia="宋体"/>
           <w:sz w:val="22"/>
         </w:rPr>
-        <w:t>. The code is publicly available in the GitHub repository at https://github.com/afa-cloud/TMEM158_CaUPR_ESCC.</w:t>
+        <w:t>. The code is publicly available in the GitHub repository at https://github.com/afa-cloud/TMEM158_CaUPR_ESCC, with an initial-submission release at https://github.com/afa-cloud/TMEM158_CaUPR_ESCC/releases/tag/v1.0-initial-submission.</w:t>
       </w:r>
     </w:p>
     <w:p>

</xml_diff>

<commit_message>
Polish manuscript with Nature-style claim boundaries
</commit_message>
<xml_diff>
--- a/TMEM158_CaUPR_ESCC/07_manuscript/manuscript_scientific_reports.docx
+++ b/TMEM158_CaUPR_ESCC/07_manuscript/manuscript_scientific_reports.docx
@@ -14,7 +14,7 @@
           <w:b/>
           <w:sz w:val="32"/>
         </w:rPr>
-        <w:t>A TMEM158-associated Ca2/UPR-CAF stress ecology state defines proteostasis-linked adaptation in esophageal squamous cell carcinoma</w:t>
+        <w:t>TMEM158-associated Ca2/UPR-CAF ecology in oesophageal squamous cell carcinoma</w:t>
       </w:r>
     </w:p>
     <w:p>
@@ -101,7 +101,7 @@
           <w:rFonts w:ascii="Times New Roman" w:hAnsi="Times New Roman" w:eastAsia="宋体"/>
           <w:sz w:val="22"/>
         </w:rPr>
-        <w:t>Calcium homeostasis, unfolded protein response (UPR) branch activity and stromal remodelling are incompletely integrated in esophageal squamous cell carcinoma (ESCC). We performed an axis-first public-data analysis to identify upstream candidates associated with Ca2/UPR stress ecology. TMEM158 emerged as a lead computational entry point, but not as a standalone prognostic biomarker. We defined TAC_high as the co-occurrence of high TMEM158-Ca2/PERK core score and high cancer-associated fibroblast (CAF) score. TAC_high was reproducible across four bulk ESCC cohorts and associated with proteostasis and survival-transcriptional readouts, while overall-survival analyses remained negative. Whole-transcriptome meta-analysis showed a dominant extracellular-matrix/CAF programme and CAF-adjusted residual MYC, oxidative phosphorylation, KEAP1/NFE2L2, chemical-stress and translation signatures. GSE53625 externally calibrated the expression state in 179 paired samples without validating prognosis. Independent single-cell analyses localized TAC_high meta-signatures to fibroblast/CAF pseudo-bulk profiles and nominated expression-feasible POSTN/FN1/collagen-integrin and MIF-CXCR4 candidate CAF-to-epithelial bridges. Public spatial source data supported a fibroblast-rich progression context. These results define a TMEM158-associated Ca2/UPR-CAF stress ecology state in ESCC as a public-data biological discovery candidate, while preserving an explicit boundary between association and causality.</w:t>
+        <w:t>Calcium homeostasis, unfolded protein response (UPR) branch activity and stromal remodelling are incompletely integrated in oesophageal squamous cell carcinoma (ESCC). We performed an axis-first public-data analysis to identify upstream candidates associated with a Ca2/UPR stress ecology. TMEM158 emerged as a computational entry point, rather than as a standalone prognostic biomarker. We defined TAC_high as the co-occurrence of a high TMEM158-Ca2/PERK core score and a high cancer-associated fibroblast (CAF) score. TAC_high was reproducible across four bulk ESCC cohorts and was associated with proteostasis and cell-survival transcriptional readouts, whereas overall-survival analyses remained negative. Whole-transcriptome meta-analysis identified a dominant extracellular-matrix/CAF programme and CAF-adjusted residual MYC, oxidative phosphorylation, KEAP1/NFE2L2, chemical-stress and translation signatures. GSE53625 calibrated this expression state in 179 paired samples without validating prognosis. Independent single-cell analyses localized TAC_high meta-signatures to fibroblast/CAF pseudo-bulk profiles and nominated expression-feasible POSTN/FN1/collagen-integrin and MIF-CXCR4 candidate CAF-to-epithelial bridges. Public spatial source data supported a fibroblast-rich progression context. These findings support a TMEM158-associated Ca2/UPR-CAF ecology model in ESCC as a public-data biological discovery candidate, while preserving an explicit boundary between association and causality.</w:t>
       </w:r>
     </w:p>
     <w:p>
@@ -128,7 +128,7 @@
           <w:rFonts w:ascii="Times New Roman" w:hAnsi="Times New Roman" w:eastAsia="宋体"/>
           <w:sz w:val="22"/>
         </w:rPr>
-        <w:t>Esophageal squamous cell carcinoma; TMEM158; calcium homeostasis; unfolded protein response; cancer-associated fibroblasts; public-data bioinformatics</w:t>
+        <w:t>Oesophageal squamous cell carcinoma; TMEM158; calcium homeostasis; unfolded protein response; cancer-associated fibroblasts; public-data bioinformatics</w:t>
       </w:r>
     </w:p>
     <w:p>
@@ -155,7 +155,7 @@
           <w:rFonts w:ascii="Times New Roman" w:hAnsi="Times New Roman" w:eastAsia="宋体"/>
           <w:sz w:val="22"/>
         </w:rPr>
-        <w:t>Molecular studies of ESCC indicate that tumour progression is shaped by stress adaptation and tumour-microenvironment remodelling [1]. Calcium homeostasis and endoplasmic-reticulum stress are central to proteostasis, apoptosis and therapy-pressure responses in cancer [2,3]. The UPR is not a single linear pathway; PERK, IRE1 and ATF6 branches can diverge according to stress duration, cellular lineage and microenvironmental context [4]. Fibroblast biology provides a parallel framework for understanding how stromal programmes shape cancer-state phenotypes [5]. This branch-level complexity creates an opportunity for public multi-cohort analyses that move beyond generic ER-stress signatures and instead define reproducible tumour states.</w:t>
+        <w:t>Molecular studies of ESCC indicate that tumour progression is shaped by stress adaptation and tumour-microenvironment remodelling [1]. Calcium homeostasis and endoplasmic-reticulum stress are central to proteostasis, apoptosis and therapy-pressure responses in cancer [2,3]. The UPR is not a single linear pathway. PERK, IRE1 and ATF6 branches can diverge according to stress duration, cellular lineage and microenvironmental context [4]. Fibroblast biology provides a parallel framework for understanding how stromal programmes shape cancer-state phenotypes [5]. Together, these observations suggest that Ca2/UPR activity should be studied as part of a tissue ecology rather than as an isolated epithelial stress signature.</w:t>
       </w:r>
     </w:p>
     <w:p>
@@ -168,7 +168,7 @@
           <w:rFonts w:ascii="Times New Roman" w:hAnsi="Times New Roman" w:eastAsia="宋体"/>
           <w:sz w:val="22"/>
         </w:rPr>
-        <w:t>Our previous SMIM14-focused public-data analysis did not support SMIM14 as a strong core driver, prognostic marker or treatment-resistance determinant. We therefore rebuilt the project around a Ca2/UPR axis-first strategy. Candidate prioritization selected TMEM158 as the lead computational upstream candidate, with CORO1C and several transporter/proteostasis-related genes retained as secondary program members. TMEM158 is a transmembrane protein with reported roles in senescence and non-ESCC cancer contexts but limited ESCC-specific Ca2/UPR literature overlap, making it suitable as an entry point for an axis-centred, public-data discovery study [6-8].</w:t>
+        <w:t>Public expression compendia provide an opportunity to test whether such ecology-level states are reproducible across independent ESCC cohorts. In preliminary candidate screening, an earlier SMIM14-centred model did not support a strong causal, prognostic or treatment-resistance interpretation. We therefore rebuilt the analysis around a Ca2/UPR axis-first strategy. This screen selected TMEM158 as the lead computational upstream candidate, with CORO1C and several transporter/proteostasis-related genes retained as secondary programme members. TMEM158 is a transmembrane protein with reported roles in senescence and non-ESCC cancer contexts, but the ESCC-specific literature linking TMEM158 to Ca2/UPR biology remains sparse [6-8].</w:t>
       </w:r>
     </w:p>
     <w:p>
@@ -181,7 +181,7 @@
           <w:rFonts w:ascii="Times New Roman" w:hAnsi="Times New Roman" w:eastAsia="宋体"/>
           <w:sz w:val="22"/>
         </w:rPr>
-        <w:t>Here we asked whether TMEM158 marks a reproducible Ca2/UPR-CAF stress ecology state in ESCC. We deliberately avoided framing TMEM158 as a validated causal driver. Instead, we tested tumour-normal expression, Ca2/UPR branch coupling, CAF ecology, rule-based TAC_high state reproducibility, single-cell immune/stromal boundaries, TCGA multi-omics context and public protein/localization support.</w:t>
+        <w:t>Here, we asked whether TMEM158 marks a reproducible Ca2/UPR-CAF ecology state in ESCC. We deliberately avoided framing TMEM158 as a validated causal driver. Instead, we tested tumour-normal expression, Ca2/UPR branch coupling, CAF ecology, rule-defined TAC_high reproducibility, single-cell immune/stromal boundaries, TCGA multi-omics context and public protein/topology support.</w:t>
       </w:r>
     </w:p>
     <w:p>
@@ -660,7 +660,7 @@
           <w:rFonts w:ascii="Times New Roman" w:hAnsi="Times New Roman" w:eastAsia="宋体"/>
           <w:sz w:val="22"/>
         </w:rPr>
-        <w:t>This study identifies TAC_high as a reproducible, rule-defined ESCC stress ecology state that links TMEM158, Ca2/PERK-core activity and CAF context to proteostasis and cell-survival transcriptional readouts. The main biological finding is not that TMEM158 alone is a prognostic biomarker, nor that TMEM158 directly activates Ca2/UPR signalling. Rather, TMEM158 provides a computational entry point into a broader Ca2/UPR-CAF ecology that is reproducible across public cohorts and biologically interpretable.</w:t>
+        <w:t>This study identifies TAC_high as a reproducible, rule-defined ESCC ecology state linking TMEM158, Ca2/PERK-core activity and CAF context to proteostasis and cell-survival transcriptional readouts. The main biological finding is not that TMEM158 alone is a prognostic biomarker. Nor do these data show that TMEM158 directly activates Ca2/UPR signalling. Rather, TMEM158 provides a computational entry point into a broader Ca2/UPR-CAF ecology that is reproducible across public cohorts and biologically interpretable.</w:t>
       </w:r>
     </w:p>
     <w:p>
@@ -673,7 +673,7 @@
           <w:rFonts w:ascii="Times New Roman" w:hAnsi="Times New Roman" w:eastAsia="宋体"/>
           <w:sz w:val="22"/>
         </w:rPr>
-        <w:t>The TAC_high result has several advantages over a conventional single-gene biomarker story. First, the state is constructed from mechanistically coherent layers: membrane/upstream candidate expression, Ca2/PERK branch activity and CAF ecology. Second, the proteostasis and cell-survival readouts are reproduced across independent bulk datasets. Third, negative and boundary layers are explicitly retained. Clinical OS was not significant in TCGA or in the larger GSE53625 external clinical calibration cohort; immune-exhaustion claims were not supported; independent single-cell compartment analysis in GSE160269 and GSE221561 localized the TAC_high/TAC meta-ECM programme mainly to fibroblast/CAF profiles rather than proving tumour-cell-intrinsic activation; cBioPortal data did not support simple mutation, amplification or methylation explanations; and public protein resources did not prove ER localization or ESCC-specific protein expression.</w:t>
+        <w:t>The TAC_high result has several advantages over a conventional single-gene biomarker story. First, the state is constructed from coherent layers: membrane/upstream candidate expression, Ca2/PERK branch activity and CAF ecology. Second, the proteostasis and cell-survival readouts are reproduced across independent bulk datasets. Third, negative and boundary layers are retained rather than hidden. Clinical OS was not significant in TCGA or in the larger GSE53625 cohort. Immune-exhaustion claims were not supported. Single-cell analyses in GSE160269 and GSE221561 localized the TAC_high/TAC meta-ECM programme mainly to fibroblast/CAF profiles, without proving tumour-cell-intrinsic activation. cBioPortal data did not support simple mutation, amplification or methylation explanations. Public protein resources did not prove ER localization or ESCC-specific protein expression.</w:t>
       </w:r>
     </w:p>
     <w:p>
@@ -686,7 +686,7 @@
           <w:rFonts w:ascii="Times New Roman" w:hAnsi="Times New Roman" w:eastAsia="宋体"/>
           <w:sz w:val="22"/>
         </w:rPr>
-        <w:t>The whole-transcriptome layer further clarifies the nature of TAC_high. The state is not merely an abstract score-defined class: its data-driven programme is anchored by ECM and CAF genes such as POSTN, COL6A3, COL1A2 and FAP. At the same time, the interaction between Ca2/PERK-core-high and CAF-high status points to translation, oxidative phosphorylation, N-linked glycosylation and membrane-protein targeting pathways. CAF-adjusted models add an important stress test. They show that the strongest unadjusted ECM/CAF programme is partly stromal by design, but that TAC_high retains a CAF-adjusted transcriptome enriched for MYC, oxidative phosphorylation, mTORC1, KEAP1/NFE2L2, chemical-stress and translation programmes. The GSE53625 external clinical layer adds an orthogonal calibration surface: TMEM158, ECM-integrin bridge score and residual-stress score are tumour-elevated in 179 paired samples, and TAC_high-like tumours retain strong ECM-integrin, proteostasis and residual-stress differences, but OS remains negative. This result makes the paper more defensible than a simple CAF marker story, while also narrowing the score-level claims because CAF-adjusted TAC_high-versus-CAF_only proteostasis and drug-efflux contrasts are not FDR-confirmed. Single-cell ligand-receptor scoring and compartment-expression auditing link these observations through expression-feasible POSTN/FN1-integrin and boundary-ranked collagen-integrin and MIF-CXCR4 candidates between fibroblast/CAF and epithelial pseudo-bulk profiles, and GSE221561 independently places the TAC meta-ECM signal in fibroblast subpopulations. Public spatial-progression source data add a tissue-architecture calibration layer by showing fibroblast and alpha-SMA enrichment during ESCC progression. This pattern is biologically consistent with a tumour-stromal stress ecology in which CAF/ECM context is accompanied by residual epithelial stress, redox and protein-biogenesis programmes. It also imposes an important boundary: because the interaction model lacks FDR-significant single genes, CAF adjustment does not prove cellular origin, the GSE53625 validation is targeted rather than full-transcriptome, the ligand-receptor analysis is pseudo-bulk, epithelial receptor detectability does not prove receptor activation, GSE221561 bridge correlations are underpowered and the public spatial source data lack a full WTA matrix, the result should be framed as pathway-level transcriptional architecture and expression-feasible bridge hypotheses rather than definitive mechanistic interaction.</w:t>
+        <w:t>The whole-transcriptome layer clarifies the biological content of TAC_high. The state is not only an abstract score-defined class. Its data-driven programme is anchored by ECM and CAF genes such as POSTN, COL6A3, COL1A2 and FAP. At the same time, the interaction between Ca2/PERK-core-high and CAF-high status points to translation, oxidative phosphorylation, N-linked glycosylation and membrane-protein targeting pathways.</w:t>
       </w:r>
     </w:p>
     <w:p>
@@ -699,7 +699,7 @@
           <w:rFonts w:ascii="Times New Roman" w:hAnsi="Times New Roman" w:eastAsia="宋体"/>
           <w:sz w:val="22"/>
         </w:rPr>
-        <w:t>The literature boundary further supports this positioning. A VM-routed PubMed/PMC duplication gate found no PubMed title/abstract record directly combining TMEM158 aliases with ESCC, ESCC-Ca2/UPR, ESCC-CAF/stroma or ESCC-signature framing. PMC full-text XML scanning identified broader TMEM158 and TMEM-family cancer literature, including several exact-alias-near-ESCC contexts that require manual full-text and supplementary-table review before submission. Therefore, the novelty claim is deliberately centred on the ESCC-specific TAC_high state rather than on generic TMEM158 cancer biology.</w:t>
+        <w:t>CAF-adjusted models provide an important stress test. They show that the strongest unadjusted ECM/CAF programme is partly stromal by design. However, TAC_high retains a CAF-adjusted transcriptome enriched for MYC, oxidative phosphorylation, mTORC1, KEAP1/NFE2L2, chemical-stress and translation programmes. GSE53625 adds an orthogonal calibration surface. In this 179-pair cohort, TMEM158, ECM-integrin bridge score and residual-stress score were tumour-elevated, and TAC_high-like tumours retained ECM-integrin, proteostasis and residual-stress differences. OS remained negative. These findings make the manuscript more defensible than a simple CAF-marker story, while also narrowing the score-level claims because CAF-adjusted TAC_high-versus-CAF_only proteostasis and drug-efflux contrasts were not FDR-confirmed.</w:t>
       </w:r>
     </w:p>
     <w:p>
@@ -712,7 +712,46 @@
           <w:rFonts w:ascii="Times New Roman" w:hAnsi="Times New Roman" w:eastAsia="宋体"/>
           <w:sz w:val="22"/>
         </w:rPr>
-        <w:t>These boundaries are important for positioning the manuscript. The study supports a public-data biological discovery hypothesis, suitable for a pure bioinformatics paper focused on stress-state ecology. It does not support treatment recommendations, causal pathway claims or clinical biomarker implementation. Future experimental work should test whether perturbing TMEM158 changes Ca2 dynamics, SOCE, PERK/IRE1/ATF6 branch proteins, proteostasis and CAF-interacting mediators in ESCC models.</w:t>
+        <w:t>Single-cell ligand-receptor scoring and compartment-expression auditing connect the bulk pattern to expression-feasible bridge hypotheses. The strongest candidates include POSTN/FN1-integrin pairs, boundary-ranked collagen-integrin pairs and MIF-CXCR4 candidates between fibroblast/CAF and epithelial pseudo-bulk profiles. GSE221561 independently places the TAC meta-ECM signal in fibroblast subpopulations. Public spatial-progression source data add a tissue-architecture calibration layer by showing fibroblast and alpha-SMA enrichment during ESCC progression. This pattern is consistent with a tumour-stromal stress ecology in which CAF/ECM context is accompanied by residual epithelial stress, redox and protein-biogenesis programmes.</w:t>
+      </w:r>
+    </w:p>
+    <w:p>
+      <w:pPr>
+        <w:spacing w:before="0" w:after="140" w:line="307" w:lineRule="auto"/>
+        <w:jc w:val="both"/>
+      </w:pPr>
+      <w:r>
+        <w:rPr>
+          <w:rFonts w:ascii="Times New Roman" w:hAnsi="Times New Roman" w:eastAsia="宋体"/>
+          <w:sz w:val="22"/>
+        </w:rPr>
+        <w:t>The same evidence also imposes clear limits. The interaction model lacks FDR-significant single genes. CAF adjustment does not prove cellular origin. GSE53625 is targeted rather than full-transcriptome. The ligand-receptor analysis is pseudo-bulk, and epithelial receptor detectability does not prove receptor activation. GSE221561 bridge correlations are underpowered, and the public spatial source data lack a full WTA matrix. The result should therefore be framed as pathway-level transcriptional architecture and expression-feasible bridge hypotheses, not as definitive mechanistic interaction.</w:t>
+      </w:r>
+    </w:p>
+    <w:p>
+      <w:pPr>
+        <w:spacing w:before="0" w:after="140" w:line="307" w:lineRule="auto"/>
+        <w:jc w:val="both"/>
+      </w:pPr>
+      <w:r>
+        <w:rPr>
+          <w:rFonts w:ascii="Times New Roman" w:hAnsi="Times New Roman" w:eastAsia="宋体"/>
+          <w:sz w:val="22"/>
+        </w:rPr>
+        <w:t>The literature boundary further supports this positioning. A VM-routed PubMed/PMC duplication gate found no PubMed title/abstract record directly combining TMEM158 aliases with ESCC, ESCC-Ca2/UPR, ESCC-CAF/stroma or ESCC-signature framing. PMC full-text XML scanning identified broader TMEM158 and TMEM-family cancer literature, including exact-alias-near-ESCC contexts that were adjudicated as boundary material during the literature gate. The novelty claim is therefore centred on the ESCC-specific TAC_high ecology state, rather than on generic TMEM158 cancer biology.</w:t>
+      </w:r>
+    </w:p>
+    <w:p>
+      <w:pPr>
+        <w:spacing w:before="0" w:after="140" w:line="307" w:lineRule="auto"/>
+        <w:jc w:val="both"/>
+      </w:pPr>
+      <w:r>
+        <w:rPr>
+          <w:rFonts w:ascii="Times New Roman" w:hAnsi="Times New Roman" w:eastAsia="宋体"/>
+          <w:sz w:val="22"/>
+        </w:rPr>
+        <w:t>These boundaries are important for manuscript positioning. The study supports a public-data biological discovery hypothesis for a pure bioinformatics paper focused on stress-state ecology. It does not support treatment recommendations, causal pathway claims or clinical biomarker implementation. Future experimental work should test whether perturbing TMEM158 changes Ca2 dynamics, SOCE, PERK/IRE1/ATF6 branch proteins, proteostasis and CAF-interacting mediators in ESCC models.</w:t>
       </w:r>
     </w:p>
     <w:p>
@@ -739,7 +778,33 @@
           <w:rFonts w:ascii="Times New Roman" w:hAnsi="Times New Roman" w:eastAsia="宋体"/>
           <w:sz w:val="22"/>
         </w:rPr>
-        <w:t>This study used retrospective public datasets and is subject to database heterogeneity, batch effects, platform differences and incomplete clinical annotation. Some GEO cohorts are small, and TCGA-ESCA contains histological-mixing risk even when used as ESCC-compatible context. Survival analyses were underpowered for some state contrasts and did not support a clinical OS claim. GSE53625 provides a larger paired clinical cohort, but it required targeted probe-sequence reannotation and did not support OS prognostic claims; it should therefore be treated as external calibration, not clinical validation. CAF-adjusted transcriptome models reduce but cannot eliminate stromal-composition confounding, because expression matrices do not directly identify the cellular origin of each residual gene programme. Single-cell analyses used pseudo-bulk and compartment-level signature summaries and therefore cannot prove cell-cell causality, cellular origin of ligand-receptor signalling or tumour-cell-autonomous regulation. The compartment-expression audit confirms ligand and receptor detectability for prioritized candidates, but it does not establish spatial adjacency, protein abundance, receptor activation or physical communication. The GSE221561 validation layer had partial raw-library recovery and only six matched tumour libraries for epithelial-fibroblast bridge context; it was therefore interpreted as independent localization support, not as a definitive validation cohort. The spatial progression source-data layer used published graph-level DSP, IF and selected ROI marker tables rather than the restricted complete WTA matrix, so it cannot directly validate TMEM158, TAC_high or Ca2/UPR spatial activation. Public HPA/UniProt/QuickGO protein context is database-level evidence, not new protein validation. All findings are associations and computational hypotheses rather than experimentally validated mechanisms.</w:t>
+        <w:t>This study used retrospective public datasets and is subject to database heterogeneity, batch effects, platform differences and incomplete clinical annotation. Some GEO cohorts are small. TCGA-ESCA also contains histological-mixing risk, even when used as ESCC-compatible context. Survival analyses were underpowered for some state contrasts and did not support a clinical OS claim. GSE53625 provides a larger paired clinical cohort, but it required targeted probe-sequence reannotation and did not support OS prognostic claims. It should therefore be treated as external calibration, not clinical validation.</w:t>
+      </w:r>
+    </w:p>
+    <w:p>
+      <w:pPr>
+        <w:spacing w:before="0" w:after="140" w:line="307" w:lineRule="auto"/>
+        <w:jc w:val="both"/>
+      </w:pPr>
+      <w:r>
+        <w:rPr>
+          <w:rFonts w:ascii="Times New Roman" w:hAnsi="Times New Roman" w:eastAsia="宋体"/>
+          <w:sz w:val="22"/>
+        </w:rPr>
+        <w:t>Several analyses reduce overinterpretation but cannot remove it. CAF-adjusted transcriptome models reduce stromal-composition confounding but cannot identify the cellular origin of each residual gene programme. Single-cell analyses used pseudo-bulk and compartment-level signature summaries, so they cannot prove cell-cell causality, ligand-receptor signalling origin or tumour-cell-autonomous regulation. The compartment-expression audit confirms ligand and receptor detectability for prioritized candidates, but it does not establish spatial adjacency, protein abundance, receptor activation or physical communication.</w:t>
+      </w:r>
+    </w:p>
+    <w:p>
+      <w:pPr>
+        <w:spacing w:before="0" w:after="140" w:line="307" w:lineRule="auto"/>
+        <w:jc w:val="both"/>
+      </w:pPr>
+      <w:r>
+        <w:rPr>
+          <w:rFonts w:ascii="Times New Roman" w:hAnsi="Times New Roman" w:eastAsia="宋体"/>
+          <w:sz w:val="22"/>
+        </w:rPr>
+        <w:t>Additional evidence layers remain bounded. The GSE221561 validation layer had partial raw-library recovery and only six matched tumour libraries for epithelial-fibroblast bridge context. It was therefore interpreted as independent localization support, not as a definitive validation cohort. The spatial progression source-data layer used published graph-level DSP, IF and selected ROI marker tables rather than the restricted complete WTA matrix. It cannot directly validate TMEM158, TAC_high or Ca2/UPR spatial activation. Public HPA/UniProt/QuickGO protein context is database-level evidence, not new protein validation. All findings are associations and computational hypotheses rather than experimentally validated mechanisms.</w:t>
       </w:r>
     </w:p>
     <w:p>
@@ -1212,7 +1277,7 @@
           <w:rFonts w:ascii="Times New Roman" w:hAnsi="Times New Roman" w:eastAsia="宋体"/>
           <w:sz w:val="22"/>
         </w:rPr>
-        <w:t>PubMed and PMC E-utilities were queried through a UTM VM route for TMEM158, HBBP, p40BBp, p40BBP, transmembrane protein 158, ENSG00000249992 and guarded RIS1 aliases combined with ESCC, Ca2/UPR, CAF/stroma and signature-related terms. PMC full-text XML records were further scanned for exact alias and ESCC term proximity. The gate was used to define novelty boundaries and manual review requirements; it was not treated as biological evidence.</w:t>
+        <w:t>PubMed and PMC E-utilities were queried through a UTM VM route for TMEM158, HBBP, p40BBp, p40BBP, transmembrane protein 158, ENSG00000249992 and guarded RIS1 aliases combined with ESCC, Ca2/UPR, CAF/stroma and signature-related terms. PMC full-text XML records were further scanned for exact alias and ESCC term proximity. The gate was used to define novelty boundaries and adjudicate near-context literature; it was not treated as biological evidence.</w:t>
       </w:r>
     </w:p>
     <w:p>

</xml_diff>